<commit_message>
Change grant deadline time from 5:00 p.m. to 6:00 p.m.
Updates every deadline occurrence on the website pages and in the 12
documents that state it. Office hours on the Contact page (8:00 a.m. to
5:00 p.m.) are unrelated and unchanged. Documents were updated by editing
only the time in their Word sources and reconverting to PDF.

Co-Authored-By: Claude Opus 5.5 <noreply@anthropic.com>
Claude-Session: https://claude.ai/code/session_01CQxLpwe1Pu1FJJBAM5jt5M
</commit_message>
<xml_diff>
--- a/documents/templates/cpcf-letter-of-inquiry-template.docx
+++ b/documents/templates/cpcf-letter-of-inquiry-template.docx
@@ -150,7 +150,7 @@
               <w:rPr>
                 <w:sz w:val="19"/>
               </w:rPr>
-              <w:t>January 15, 2027, 5:00 p.m. MST</w:t>
+              <w:t>January 15, 2027, 6:00 p.m. MST</w:t>
             </w:r>
           </w:p>
         </w:tc>
@@ -203,7 +203,7 @@
               <w:rPr>
                 <w:sz w:val="19"/>
               </w:rPr>
-              <w:t>December 4, 2026, 5:00 p.m. MST</w:t>
+              <w:t>December 4, 2026, 6:00 p.m. MST</w:t>
             </w:r>
           </w:p>
         </w:tc>
@@ -256,7 +256,7 @@
               <w:rPr>
                 <w:sz w:val="19"/>
               </w:rPr>
-              <w:t>November 13, 2026, 5:00 p.m. MST</w:t>
+              <w:t>November 13, 2026, 6:00 p.m. MST</w:t>
             </w:r>
           </w:p>
         </w:tc>

</xml_diff>